<commit_message>
Add multi-user login (auth gate, session cookie, user CLI) + remove Add Website button from Overview
</commit_message>
<xml_diff>
--- a/docs/PANDUAN-PENGGUNA.docx
+++ b/docs/PANDUAN-PENGGUNA.docx
@@ -270,6 +270,112 @@
       </w:pPr>
       <w:r>
         <w:t>cukup buka alamatnya.</w:t>
+      </w:r>
+    </w:p>
+    <w:p>
+      <w:pPr>
+        <w:pStyle w:val="Heading3"/>
+      </w:pPr>
+      <w:r>
+        <w:t>Masuk (login)</w:t>
+      </w:r>
+    </w:p>
+    <w:p>
+      <w:r>
+        <w:t>Dashboard dilindungi login. Saat membuka alamatnya, kamu akan diarahkan ke</w:t>
+      </w:r>
+    </w:p>
+    <w:p>
+      <w:r>
+        <w:t xml:space="preserve">halaman </w:t>
+      </w:r>
+      <w:r>
+        <w:rPr>
+          <w:b/>
+        </w:rPr>
+        <w:t>Masuk</w:t>
+      </w:r>
+      <w:r>
+        <w:t>. Isi username dan password yang diberikan admin, lalu klik</w:t>
+      </w:r>
+    </w:p>
+    <w:p>
+      <w:r>
+        <w:rPr>
+          <w:b/>
+        </w:rPr>
+        <w:t>Masuk</w:t>
+      </w:r>
+      <w:r>
+        <w:t>.</w:t>
+      </w:r>
+    </w:p>
+    <w:p>
+      <w:pPr>
+        <w:pStyle w:val="ListBullet"/>
+      </w:pPr>
+      <w:r>
+        <w:t>Setelah berhasil, kamu tetap masuk selama beberapa hari (tidak perlu login</w:t>
+      </w:r>
+    </w:p>
+    <w:p>
+      <w:r>
+        <w:t xml:space="preserve">ulang tiap buka), kecuali kamu menekan </w:t>
+      </w:r>
+      <w:r>
+        <w:rPr>
+          <w:b/>
+        </w:rPr>
+        <w:t>Keluar</w:t>
+      </w:r>
+      <w:r>
+        <w:t>.</w:t>
+      </w:r>
+    </w:p>
+    <w:p>
+      <w:pPr>
+        <w:pStyle w:val="ListBullet"/>
+      </w:pPr>
+      <w:r>
+        <w:t xml:space="preserve">Tombol </w:t>
+      </w:r>
+      <w:r>
+        <w:rPr>
+          <w:b/>
+        </w:rPr>
+        <w:t>Keluar</w:t>
+      </w:r>
+      <w:r>
+        <w:t xml:space="preserve"> ada di kiri bawah (pojok sidebar), di bawah nama akunmu.</w:t>
+      </w:r>
+    </w:p>
+    <w:p>
+      <w:pPr>
+        <w:pStyle w:val="ListBullet"/>
+      </w:pPr>
+      <w:r>
+        <w:t>Lupa password? Minta admin mengganti password akunmu (lihat panduan deploy</w:t>
+      </w:r>
+    </w:p>
+    <w:p>
+      <w:r>
+        <w:t>untuk perintahnya).</w:t>
+      </w:r>
+    </w:p>
+    <w:p>
+      <w:pPr>
+        <w:pStyle w:val="IntenseQuote"/>
+      </w:pPr>
+      <w:r>
+        <w:t>Admin membuat akun lewat command line di server. Tiap anggota tim sebaiknya</w:t>
+      </w:r>
+    </w:p>
+    <w:p>
+      <w:pPr>
+        <w:pStyle w:val="IntenseQuote"/>
+      </w:pPr>
+      <w:r>
+        <w:t>punya akun sendiri.</w:t>
       </w:r>
     </w:p>
     <w:p>
@@ -2009,6 +2115,42 @@
     <w:p>
       <w:r>
         <w:t>sangat bergantung pada JavaScript mungkin tidak terbaca sempurna.</w:t>
+      </w:r>
+    </w:p>
+    <w:p>
+      <w:r>
+        <w:rPr>
+          <w:b/>
+        </w:rPr>
+        <w:t>Bagaimana cara menambah akun untuk anggota tim baru?</w:t>
+      </w:r>
+    </w:p>
+    <w:p>
+      <w:r>
+        <w:t>Admin membuat akun lewat command line di server (usertool add &lt;nama&gt;). Tiap</w:t>
+      </w:r>
+    </w:p>
+    <w:p>
+      <w:r>
+        <w:t>orang sebaiknya punya akun sendiri. Lihat panduan deploy untuk detailnya.</w:t>
+      </w:r>
+    </w:p>
+    <w:p>
+      <w:r>
+        <w:rPr>
+          <w:b/>
+        </w:rPr>
+        <w:t>Saya lupa password, bagaimana?</w:t>
+      </w:r>
+    </w:p>
+    <w:p>
+      <w:r>
+        <w:t>Minta admin mereset lewat perintah usertool passwd &lt;username&gt; di server.</w:t>
+      </w:r>
+    </w:p>
+    <w:p>
+      <w:r>
+        <w:t>Tidak ada reset password mandiri lewat halaman web pada versi ini.</w:t>
       </w:r>
     </w:p>
     <w:p>

</xml_diff>